<commit_message>
2026-8-8 Deploy a 3 tier Fullstack  app with python backend +  RDS cache
</commit_message>
<xml_diff>
--- a/AWS/26-8-3 Python and node deployment with RDS/8 Deploy Backend using python , connect it to RDS DB with Redis Cache ..docx
+++ b/AWS/26-8-3 Python and node deployment with RDS/8 Deploy Backend using python , connect it to RDS DB with Redis Cache ..docx
@@ -4,7 +4,23 @@
   <w:body>
     <w:p>
       <w:r>
-        <w:t>Deploy Backend using python , connect it to RDS DB with Redis Cache .</w:t>
+        <w:t xml:space="preserve">Deploy Backend using </w:t>
+      </w:r>
+      <w:proofErr w:type="gramStart"/>
+      <w:r>
+        <w:t>python ,</w:t>
+      </w:r>
+      <w:proofErr w:type="gramEnd"/>
+      <w:r>
+        <w:t xml:space="preserve"> connect it to RDS DB with </w:t>
+      </w:r>
+      <w:proofErr w:type="spellStart"/>
+      <w:r>
+        <w:t>Redis</w:t>
+      </w:r>
+      <w:proofErr w:type="spellEnd"/>
+      <w:r>
+        <w:t xml:space="preserve"> Cache .</w:t>
       </w:r>
     </w:p>
     <w:p>
@@ -91,7 +107,15 @@
         <w:pStyle w:val="ListParagraph"/>
       </w:pPr>
       <w:r>
-        <w:t xml:space="preserve"> (public access  + public subnet + </w:t>
+        <w:t xml:space="preserve"> (</w:t>
+      </w:r>
+      <w:proofErr w:type="gramStart"/>
+      <w:r>
+        <w:t>public</w:t>
+      </w:r>
+      <w:proofErr w:type="gramEnd"/>
+      <w:r>
+        <w:t xml:space="preserve"> access  + public subnet + </w:t>
       </w:r>
       <w:r>
         <w:t>self-managed passwor</w:t>
@@ -163,10 +187,26 @@
     <w:p>
       <w:r>
         <w:tab/>
-        <w:t>Create read replica</w:t>
-      </w:r>
-      <w:r>
-        <w:t xml:space="preserve"> . here we are creating it for testing purpose.</w:t>
+        <w:t xml:space="preserve">Create read </w:t>
+      </w:r>
+      <w:proofErr w:type="gramStart"/>
+      <w:r>
+        <w:t>replica</w:t>
+      </w:r>
+      <w:r>
+        <w:t xml:space="preserve"> .</w:t>
+      </w:r>
+      <w:proofErr w:type="gramEnd"/>
+      <w:r>
+        <w:t xml:space="preserve"> </w:t>
+      </w:r>
+      <w:proofErr w:type="gramStart"/>
+      <w:r>
+        <w:t>here</w:t>
+      </w:r>
+      <w:proofErr w:type="gramEnd"/>
+      <w:r>
+        <w:t xml:space="preserve"> we are creating it for testing purpose.</w:t>
       </w:r>
     </w:p>
     <w:p>
@@ -232,11 +272,26 @@
         <w:tab/>
         <w:t xml:space="preserve">Try to connect with both RDS DB using </w:t>
       </w:r>
-      <w:r>
-        <w:rPr>
-          <w:b/>
-        </w:rPr>
-        <w:t>mysql workbench</w:t>
+      <w:proofErr w:type="spellStart"/>
+      <w:r>
+        <w:rPr>
+          <w:b/>
+        </w:rPr>
+        <w:t>mysql</w:t>
+      </w:r>
+      <w:proofErr w:type="spellEnd"/>
+      <w:r>
+        <w:rPr>
+          <w:b/>
+        </w:rPr>
+        <w:t xml:space="preserve"> </w:t>
+      </w:r>
+      <w:proofErr w:type="gramStart"/>
+      <w:r>
+        <w:rPr>
+          <w:b/>
+        </w:rPr>
+        <w:t>workbench</w:t>
       </w:r>
       <w:r>
         <w:rPr>
@@ -245,7 +300,11 @@
         <w:t xml:space="preserve">  </w:t>
       </w:r>
       <w:r>
-        <w:t>to check connection</w:t>
+        <w:t>to</w:t>
+      </w:r>
+      <w:proofErr w:type="gramEnd"/>
+      <w:r>
+        <w:t xml:space="preserve"> check connection</w:t>
       </w:r>
     </w:p>
     <w:p>
@@ -435,7 +494,15 @@
     </w:p>
     <w:p>
       <w:r>
-        <w:t>Give a name , select options and create.</w:t>
+        <w:t xml:space="preserve">Give a </w:t>
+      </w:r>
+      <w:proofErr w:type="gramStart"/>
+      <w:r>
+        <w:t>name ,</w:t>
+      </w:r>
+      <w:proofErr w:type="gramEnd"/>
+      <w:r>
+        <w:t xml:space="preserve"> select options and create.</w:t>
       </w:r>
     </w:p>
     <w:p>
@@ -633,7 +700,15 @@
     <w:p/>
     <w:p>
       <w:r>
-        <w:t xml:space="preserve">Switch to root &gt;create  and move to </w:t>
+        <w:t>Switch to root &gt;</w:t>
+      </w:r>
+      <w:proofErr w:type="gramStart"/>
+      <w:r>
+        <w:t>create  and</w:t>
+      </w:r>
+      <w:proofErr w:type="gramEnd"/>
+      <w:r>
+        <w:t xml:space="preserve"> move to </w:t>
       </w:r>
       <w:r>
         <w:rPr>
@@ -668,24 +743,40 @@
           <w:b/>
         </w:rPr>
       </w:pPr>
-      <w:r>
-        <w:rPr>
-          <w:b/>
-        </w:rPr>
-        <w:t>yum install python –y</w:t>
-      </w:r>
-    </w:p>
-    <w:p>
-      <w:pPr>
-        <w:rPr>
-          <w:b/>
-        </w:rPr>
-      </w:pPr>
-      <w:r>
-        <w:rPr>
-          <w:b/>
-        </w:rPr>
-        <w:t xml:space="preserve">yum install pip </w:t>
+      <w:proofErr w:type="gramStart"/>
+      <w:r>
+        <w:rPr>
+          <w:b/>
+        </w:rPr>
+        <w:t>yum</w:t>
+      </w:r>
+      <w:proofErr w:type="gramEnd"/>
+      <w:r>
+        <w:rPr>
+          <w:b/>
+        </w:rPr>
+        <w:t xml:space="preserve"> install python –y</w:t>
+      </w:r>
+    </w:p>
+    <w:p>
+      <w:pPr>
+        <w:rPr>
+          <w:b/>
+        </w:rPr>
+      </w:pPr>
+      <w:proofErr w:type="gramStart"/>
+      <w:r>
+        <w:rPr>
+          <w:b/>
+        </w:rPr>
+        <w:t>yum</w:t>
+      </w:r>
+      <w:proofErr w:type="gramEnd"/>
+      <w:r>
+        <w:rPr>
+          <w:b/>
+        </w:rPr>
+        <w:t xml:space="preserve"> install pip </w:t>
       </w:r>
       <w:r>
         <w:rPr>
@@ -711,8 +802,13 @@
         <w:t>irement</w:t>
       </w:r>
       <w:r>
-        <w:t>.txt and include backend dependencies .</w:t>
-      </w:r>
+        <w:t xml:space="preserve">.txt and include backend </w:t>
+      </w:r>
+      <w:proofErr w:type="gramStart"/>
+      <w:r>
+        <w:t>dependencies .</w:t>
+      </w:r>
+      <w:proofErr w:type="gramEnd"/>
     </w:p>
     <w:p>
       <w:r>
@@ -777,7 +873,21 @@
         <w:rPr>
           <w:b/>
         </w:rPr>
-        <w:t>pip install  –r requirements.txt</w:t>
+        <w:t xml:space="preserve">pip </w:t>
+      </w:r>
+      <w:proofErr w:type="gramStart"/>
+      <w:r>
+        <w:rPr>
+          <w:b/>
+        </w:rPr>
+        <w:t>install  –</w:t>
+      </w:r>
+      <w:proofErr w:type="gramEnd"/>
+      <w:r>
+        <w:rPr>
+          <w:b/>
+        </w:rPr>
+        <w:t>r requirements.txt</w:t>
       </w:r>
     </w:p>
     <w:p>
@@ -837,7 +947,23 @@
     <w:p/>
     <w:p>
       <w:r>
-        <w:t>-we can use mysql agent to test , backend to RDS database-1 connection.</w:t>
+        <w:t xml:space="preserve">-we can use </w:t>
+      </w:r>
+      <w:proofErr w:type="spellStart"/>
+      <w:r>
+        <w:t>mysql</w:t>
+      </w:r>
+      <w:proofErr w:type="spellEnd"/>
+      <w:r>
+        <w:t xml:space="preserve"> agent to </w:t>
+      </w:r>
+      <w:proofErr w:type="gramStart"/>
+      <w:r>
+        <w:t>test ,</w:t>
+      </w:r>
+      <w:proofErr w:type="gramEnd"/>
+      <w:r>
+        <w:t xml:space="preserve"> backend to RDS database-1 connection.</w:t>
       </w:r>
     </w:p>
     <w:p>
@@ -848,7 +974,14 @@
       </w:pPr>
       <w:r>
         <w:tab/>
-        <w:t xml:space="preserve">a. install agent -&gt;  </w:t>
+      </w:r>
+      <w:proofErr w:type="gramStart"/>
+      <w:r>
+        <w:t>a</w:t>
+      </w:r>
+      <w:proofErr w:type="gramEnd"/>
+      <w:r>
+        <w:t xml:space="preserve">. install agent -&gt;  </w:t>
       </w:r>
       <w:r>
         <w:rPr>
@@ -912,7 +1045,16 @@
     <w:p>
       <w:r>
         <w:tab/>
-        <w:t>b.use this to connect -&gt;</w:t>
+      </w:r>
+      <w:proofErr w:type="spellStart"/>
+      <w:proofErr w:type="gramStart"/>
+      <w:r>
+        <w:t>b.use</w:t>
+      </w:r>
+      <w:proofErr w:type="spellEnd"/>
+      <w:proofErr w:type="gramEnd"/>
+      <w:r>
+        <w:t xml:space="preserve"> this to connect -&gt;</w:t>
       </w:r>
     </w:p>
     <w:p>
@@ -923,11 +1065,19 @@
         <w:lastRenderedPageBreak/>
         <w:t>#</w:t>
       </w:r>
-      <w:r>
-        <w:rPr>
-          <w:b/>
-        </w:rPr>
-        <w:t>mysql -h database-1.c6xkgac6c5dq.us-east-1.rds.amazonaws.com -u admin -p</w:t>
+      <w:proofErr w:type="spellStart"/>
+      <w:r>
+        <w:rPr>
+          <w:b/>
+        </w:rPr>
+        <w:t>mysql</w:t>
+      </w:r>
+      <w:proofErr w:type="spellEnd"/>
+      <w:r>
+        <w:rPr>
+          <w:b/>
+        </w:rPr>
+        <w:t xml:space="preserve"> -h database-1.c6xkgac6c5dq.us-east-1.rds.amazonaws.com -u admin -p</w:t>
       </w:r>
       <w:r>
         <w:t xml:space="preserve"> </w:t>
@@ -1013,14 +1163,30 @@
         <w:t xml:space="preserve"> server</w:t>
       </w:r>
       <w:r>
-        <w:t xml:space="preserve"> by using mariadb105 , then you can create a file with </w:t>
-      </w:r>
-      <w:r>
-        <w:rPr>
-          <w:b/>
-        </w:rPr>
-        <w:t>.sql</w:t>
-      </w:r>
+        <w:t xml:space="preserve"> by using </w:t>
+      </w:r>
+      <w:proofErr w:type="gramStart"/>
+      <w:r>
+        <w:t>mariadb105 ,</w:t>
+      </w:r>
+      <w:proofErr w:type="gramEnd"/>
+      <w:r>
+        <w:t xml:space="preserve"> then you can create a file with </w:t>
+      </w:r>
+      <w:r>
+        <w:rPr>
+          <w:b/>
+        </w:rPr>
+        <w:t>.</w:t>
+      </w:r>
+      <w:proofErr w:type="spellStart"/>
+      <w:r>
+        <w:rPr>
+          <w:b/>
+        </w:rPr>
+        <w:t>sql</w:t>
+      </w:r>
+      <w:proofErr w:type="spellEnd"/>
       <w:r>
         <w:t xml:space="preserve"> extension and include the query </w:t>
       </w:r>
@@ -1047,7 +1213,14 @@
         <w:rPr>
           <w:b/>
         </w:rPr>
-        <w:t xml:space="preserve"> [ </w:t>
+        <w:t xml:space="preserve"> </w:t>
+      </w:r>
+      <w:proofErr w:type="gramStart"/>
+      <w:r>
+        <w:rPr>
+          <w:b/>
+        </w:rPr>
+        <w:t xml:space="preserve">[ </w:t>
       </w:r>
       <w:r>
         <w:rPr>
@@ -1055,6 +1228,7 @@
         </w:rPr>
         <w:t>include</w:t>
       </w:r>
+      <w:proofErr w:type="gramEnd"/>
       <w:r>
         <w:rPr>
           <w:b/>
@@ -1162,7 +1336,27 @@
           <w:sz w:val="20"/>
           <w:szCs w:val="20"/>
         </w:rPr>
-        <w:t xml:space="preserve"># mysql -h database-1.c6xkgac6c5dq.us-east-1.rds.amazonaws.com -u admin </w:t>
+        <w:t xml:space="preserve"># </w:t>
+      </w:r>
+      <w:proofErr w:type="spellStart"/>
+      <w:proofErr w:type="gramStart"/>
+      <w:r>
+        <w:rPr>
+          <w:b/>
+          <w:sz w:val="20"/>
+          <w:szCs w:val="20"/>
+        </w:rPr>
+        <w:t>mysql</w:t>
+      </w:r>
+      <w:proofErr w:type="spellEnd"/>
+      <w:proofErr w:type="gramEnd"/>
+      <w:r>
+        <w:rPr>
+          <w:b/>
+          <w:sz w:val="20"/>
+          <w:szCs w:val="20"/>
+        </w:rPr>
+        <w:t xml:space="preserve"> -h database-1.c6xkgac6c5dq.us-east-1.rds.amazonaws.com -u admin </w:t>
       </w:r>
       <w:r>
         <w:rPr>
@@ -1174,6 +1368,7 @@
         </w:rPr>
         <w:t>-</w:t>
       </w:r>
+      <w:proofErr w:type="spellStart"/>
       <w:r>
         <w:rPr>
           <w:b/>
@@ -1184,6 +1379,7 @@
         </w:rPr>
         <w:t>p'AdminMukesh</w:t>
       </w:r>
+      <w:proofErr w:type="spellEnd"/>
       <w:r>
         <w:rPr>
           <w:b/>
@@ -1270,7 +1466,15 @@
     </w:p>
     <w:p>
       <w:r>
-        <w:t>Now create test.sql , include below code and execute .</w:t>
+        <w:t xml:space="preserve">Now create </w:t>
+      </w:r>
+      <w:proofErr w:type="gramStart"/>
+      <w:r>
+        <w:t>test.sql ,</w:t>
+      </w:r>
+      <w:proofErr w:type="gramEnd"/>
+      <w:r>
+        <w:t xml:space="preserve"> include below code and execute .</w:t>
       </w:r>
     </w:p>
     <w:p>
@@ -1501,7 +1705,27 @@
           <w:sz w:val="12"/>
           <w:szCs w:val="12"/>
         </w:rPr>
-        <w:t xml:space="preserve">    id </w:t>
+        <w:t xml:space="preserve">    </w:t>
+      </w:r>
+      <w:proofErr w:type="gramStart"/>
+      <w:r>
+        <w:rPr>
+          <w:rFonts w:ascii="Consolas" w:eastAsia="Times New Roman" w:hAnsi="Consolas" w:cs="Times New Roman"/>
+          <w:color w:val="BBBEBF"/>
+          <w:sz w:val="12"/>
+          <w:szCs w:val="12"/>
+        </w:rPr>
+        <w:t>id</w:t>
+      </w:r>
+      <w:proofErr w:type="gramEnd"/>
+      <w:r>
+        <w:rPr>
+          <w:rFonts w:ascii="Consolas" w:eastAsia="Times New Roman" w:hAnsi="Consolas" w:cs="Times New Roman"/>
+          <w:color w:val="BBBEBF"/>
+          <w:sz w:val="12"/>
+          <w:szCs w:val="12"/>
+        </w:rPr>
+        <w:t xml:space="preserve"> </w:t>
       </w:r>
       <w:r>
         <w:rPr>
@@ -1560,6 +1784,7 @@
         </w:rPr>
         <w:t xml:space="preserve">    </w:t>
       </w:r>
+      <w:proofErr w:type="gramStart"/>
       <w:r>
         <w:rPr>
           <w:rFonts w:ascii="Consolas" w:eastAsia="Times New Roman" w:hAnsi="Consolas" w:cs="Times New Roman"/>
@@ -1569,6 +1794,7 @@
         </w:rPr>
         <w:t>name</w:t>
       </w:r>
+      <w:proofErr w:type="gramEnd"/>
       <w:r>
         <w:rPr>
           <w:rFonts w:ascii="Consolas" w:eastAsia="Times New Roman" w:hAnsi="Consolas" w:cs="Times New Roman"/>
@@ -1651,7 +1877,27 @@
           <w:sz w:val="12"/>
           <w:szCs w:val="12"/>
         </w:rPr>
-        <w:t xml:space="preserve">    email </w:t>
+        <w:t xml:space="preserve">    </w:t>
+      </w:r>
+      <w:proofErr w:type="gramStart"/>
+      <w:r>
+        <w:rPr>
+          <w:rFonts w:ascii="Consolas" w:eastAsia="Times New Roman" w:hAnsi="Consolas" w:cs="Times New Roman"/>
+          <w:color w:val="BBBEBF"/>
+          <w:sz w:val="12"/>
+          <w:szCs w:val="12"/>
+        </w:rPr>
+        <w:t>email</w:t>
+      </w:r>
+      <w:proofErr w:type="gramEnd"/>
+      <w:r>
+        <w:rPr>
+          <w:rFonts w:ascii="Consolas" w:eastAsia="Times New Roman" w:hAnsi="Consolas" w:cs="Times New Roman"/>
+          <w:color w:val="BBBEBF"/>
+          <w:sz w:val="12"/>
+          <w:szCs w:val="12"/>
+        </w:rPr>
+        <w:t xml:space="preserve"> </w:t>
       </w:r>
       <w:r>
         <w:rPr>
@@ -2126,6 +2372,7 @@
       <w:r>
         <w:t>-</w:t>
       </w:r>
+      <w:proofErr w:type="gramStart"/>
       <w:r>
         <w:t xml:space="preserve">create  </w:t>
       </w:r>
@@ -2135,6 +2382,7 @@
         </w:rPr>
         <w:t>app.py</w:t>
       </w:r>
+      <w:proofErr w:type="gramEnd"/>
       <w:r>
         <w:t xml:space="preserve"> </w:t>
       </w:r>
@@ -2159,28 +2407,119 @@
     </w:p>
     <w:p>
       <w:r>
-        <w:t>In that code Update the metrics</w:t>
-      </w:r>
-    </w:p>
-    <w:p>
-      <w:r>
-        <w:t xml:space="preserve"> – 1. rds dns</w:t>
-      </w:r>
-    </w:p>
-    <w:p>
-      <w:r>
-        <w:t>-2 . reader –replica dns</w:t>
-      </w:r>
-    </w:p>
-    <w:p>
-      <w:r>
-        <w:t xml:space="preserve">-3 . redis chache dns  </w:t>
-      </w:r>
-    </w:p>
-    <w:p>
-      <w:r>
-        <w:t>In redis cache section .</w:t>
-      </w:r>
+        <w:t xml:space="preserve">In that code </w:t>
+      </w:r>
+      <w:proofErr w:type="gramStart"/>
+      <w:r>
+        <w:t>Update</w:t>
+      </w:r>
+      <w:proofErr w:type="gramEnd"/>
+      <w:r>
+        <w:t xml:space="preserve"> the metrics</w:t>
+      </w:r>
+    </w:p>
+    <w:p>
+      <w:r>
+        <w:t xml:space="preserve"> – 1. </w:t>
+      </w:r>
+      <w:proofErr w:type="spellStart"/>
+      <w:proofErr w:type="gramStart"/>
+      <w:r>
+        <w:t>rds</w:t>
+      </w:r>
+      <w:proofErr w:type="spellEnd"/>
+      <w:proofErr w:type="gramEnd"/>
+      <w:r>
+        <w:t xml:space="preserve"> </w:t>
+      </w:r>
+      <w:proofErr w:type="spellStart"/>
+      <w:r>
+        <w:t>dns</w:t>
+      </w:r>
+      <w:proofErr w:type="spellEnd"/>
+    </w:p>
+    <w:p>
+      <w:r>
+        <w:t>-</w:t>
+      </w:r>
+      <w:proofErr w:type="gramStart"/>
+      <w:r>
+        <w:t>2 .</w:t>
+      </w:r>
+      <w:proofErr w:type="gramEnd"/>
+      <w:r>
+        <w:t xml:space="preserve"> </w:t>
+      </w:r>
+      <w:proofErr w:type="gramStart"/>
+      <w:r>
+        <w:t>reader</w:t>
+      </w:r>
+      <w:proofErr w:type="gramEnd"/>
+      <w:r>
+        <w:t xml:space="preserve"> –replica </w:t>
+      </w:r>
+      <w:proofErr w:type="spellStart"/>
+      <w:r>
+        <w:t>dns</w:t>
+      </w:r>
+      <w:proofErr w:type="spellEnd"/>
+    </w:p>
+    <w:p>
+      <w:r>
+        <w:t>-</w:t>
+      </w:r>
+      <w:proofErr w:type="gramStart"/>
+      <w:r>
+        <w:t>3 .</w:t>
+      </w:r>
+      <w:proofErr w:type="gramEnd"/>
+      <w:r>
+        <w:t xml:space="preserve"> </w:t>
+      </w:r>
+      <w:proofErr w:type="spellStart"/>
+      <w:proofErr w:type="gramStart"/>
+      <w:r>
+        <w:t>redis</w:t>
+      </w:r>
+      <w:proofErr w:type="spellEnd"/>
+      <w:proofErr w:type="gramEnd"/>
+      <w:r>
+        <w:t xml:space="preserve"> </w:t>
+      </w:r>
+      <w:proofErr w:type="spellStart"/>
+      <w:r>
+        <w:t>chache</w:t>
+      </w:r>
+      <w:proofErr w:type="spellEnd"/>
+      <w:r>
+        <w:t xml:space="preserve"> </w:t>
+      </w:r>
+      <w:proofErr w:type="spellStart"/>
+      <w:r>
+        <w:t>dns</w:t>
+      </w:r>
+      <w:proofErr w:type="spellEnd"/>
+      <w:r>
+        <w:t xml:space="preserve">  </w:t>
+      </w:r>
+    </w:p>
+    <w:p>
+      <w:r>
+        <w:t xml:space="preserve">In </w:t>
+      </w:r>
+      <w:proofErr w:type="spellStart"/>
+      <w:r>
+        <w:t>redis</w:t>
+      </w:r>
+      <w:proofErr w:type="spellEnd"/>
+      <w:r>
+        <w:t xml:space="preserve"> cache </w:t>
+      </w:r>
+      <w:proofErr w:type="gramStart"/>
+      <w:r>
+        <w:t>section .</w:t>
+      </w:r>
+      <w:proofErr w:type="gramEnd"/>
     </w:p>
     <w:p>
       <w:pPr>
@@ -2256,14 +2595,25 @@
           <w:szCs w:val="14"/>
         </w:rPr>
       </w:pPr>
-      <w:r>
-        <w:rPr>
-          <w:rFonts w:ascii="Consolas" w:eastAsia="Times New Roman" w:hAnsi="Consolas" w:cs="Times New Roman"/>
-          <w:color w:val="BBBEBF"/>
-          <w:sz w:val="14"/>
-          <w:szCs w:val="14"/>
-        </w:rPr>
-        <w:t xml:space="preserve">redis_client </w:t>
+      <w:proofErr w:type="spellStart"/>
+      <w:r>
+        <w:rPr>
+          <w:rFonts w:ascii="Consolas" w:eastAsia="Times New Roman" w:hAnsi="Consolas" w:cs="Times New Roman"/>
+          <w:color w:val="BBBEBF"/>
+          <w:sz w:val="14"/>
+          <w:szCs w:val="14"/>
+        </w:rPr>
+        <w:t>redis_client</w:t>
+      </w:r>
+      <w:proofErr w:type="spellEnd"/>
+      <w:r>
+        <w:rPr>
+          <w:rFonts w:ascii="Consolas" w:eastAsia="Times New Roman" w:hAnsi="Consolas" w:cs="Times New Roman"/>
+          <w:color w:val="BBBEBF"/>
+          <w:sz w:val="14"/>
+          <w:szCs w:val="14"/>
+        </w:rPr>
+        <w:t xml:space="preserve"> </w:t>
       </w:r>
       <w:r>
         <w:rPr>
@@ -2281,8 +2631,30 @@
           <w:sz w:val="14"/>
           <w:szCs w:val="14"/>
         </w:rPr>
-        <w:t xml:space="preserve"> redis.Redis(</w:t>
-      </w:r>
+        <w:t xml:space="preserve"> </w:t>
+      </w:r>
+      <w:proofErr w:type="spellStart"/>
+      <w:proofErr w:type="gramStart"/>
+      <w:r>
+        <w:rPr>
+          <w:rFonts w:ascii="Consolas" w:eastAsia="Times New Roman" w:hAnsi="Consolas" w:cs="Times New Roman"/>
+          <w:color w:val="BBBEBF"/>
+          <w:sz w:val="14"/>
+          <w:szCs w:val="14"/>
+        </w:rPr>
+        <w:t>redis.Redis</w:t>
+      </w:r>
+      <w:proofErr w:type="spellEnd"/>
+      <w:r>
+        <w:rPr>
+          <w:rFonts w:ascii="Consolas" w:eastAsia="Times New Roman" w:hAnsi="Consolas" w:cs="Times New Roman"/>
+          <w:color w:val="BBBEBF"/>
+          <w:sz w:val="14"/>
+          <w:szCs w:val="14"/>
+        </w:rPr>
+        <w:t>(</w:t>
+      </w:r>
+      <w:proofErr w:type="gramEnd"/>
     </w:p>
     <w:p>
       <w:pPr>
@@ -2304,6 +2676,7 @@
         </w:rPr>
         <w:t xml:space="preserve">    </w:t>
       </w:r>
+      <w:proofErr w:type="gramStart"/>
       <w:r>
         <w:rPr>
           <w:rFonts w:ascii="Consolas" w:eastAsia="Times New Roman" w:hAnsi="Consolas" w:cs="Times New Roman"/>
@@ -2313,6 +2686,7 @@
         </w:rPr>
         <w:t>host</w:t>
       </w:r>
+      <w:proofErr w:type="gramEnd"/>
       <w:r>
         <w:rPr>
           <w:rFonts w:ascii="Consolas" w:eastAsia="Times New Roman" w:hAnsi="Consolas" w:cs="Times New Roman"/>
@@ -2367,15 +2741,37 @@
         </w:rPr>
         <w:t xml:space="preserve"> #</w:t>
       </w:r>
-      <w:r>
-        <w:rPr>
-          <w:rFonts w:ascii="Consolas" w:eastAsia="Times New Roman" w:hAnsi="Consolas" w:cs="Times New Roman"/>
-          <w:color w:val="BBBEBF"/>
-          <w:sz w:val="14"/>
-          <w:szCs w:val="14"/>
-        </w:rPr>
-        <w:t>rdis dns</w:t>
-      </w:r>
+      <w:proofErr w:type="spellStart"/>
+      <w:r>
+        <w:rPr>
+          <w:rFonts w:ascii="Consolas" w:eastAsia="Times New Roman" w:hAnsi="Consolas" w:cs="Times New Roman"/>
+          <w:color w:val="BBBEBF"/>
+          <w:sz w:val="14"/>
+          <w:szCs w:val="14"/>
+        </w:rPr>
+        <w:t>rdis</w:t>
+      </w:r>
+      <w:proofErr w:type="spellEnd"/>
+      <w:r>
+        <w:rPr>
+          <w:rFonts w:ascii="Consolas" w:eastAsia="Times New Roman" w:hAnsi="Consolas" w:cs="Times New Roman"/>
+          <w:color w:val="BBBEBF"/>
+          <w:sz w:val="14"/>
+          <w:szCs w:val="14"/>
+        </w:rPr>
+        <w:t xml:space="preserve"> </w:t>
+      </w:r>
+      <w:proofErr w:type="spellStart"/>
+      <w:r>
+        <w:rPr>
+          <w:rFonts w:ascii="Consolas" w:eastAsia="Times New Roman" w:hAnsi="Consolas" w:cs="Times New Roman"/>
+          <w:color w:val="BBBEBF"/>
+          <w:sz w:val="14"/>
+          <w:szCs w:val="14"/>
+        </w:rPr>
+        <w:t>dns</w:t>
+      </w:r>
+      <w:proofErr w:type="spellEnd"/>
     </w:p>
     <w:p>
       <w:pPr>
@@ -2397,6 +2793,7 @@
         </w:rPr>
         <w:t xml:space="preserve">    </w:t>
       </w:r>
+      <w:proofErr w:type="gramStart"/>
       <w:r>
         <w:rPr>
           <w:rFonts w:ascii="Consolas" w:eastAsia="Times New Roman" w:hAnsi="Consolas" w:cs="Times New Roman"/>
@@ -2415,6 +2812,7 @@
         </w:rPr>
         <w:t>=</w:t>
       </w:r>
+      <w:proofErr w:type="gramEnd"/>
       <w:r>
         <w:rPr>
           <w:rFonts w:ascii="Consolas" w:eastAsia="Times New Roman" w:hAnsi="Consolas" w:cs="Times New Roman"/>
@@ -2454,6 +2852,8 @@
         </w:rPr>
         <w:t xml:space="preserve">    </w:t>
       </w:r>
+      <w:proofErr w:type="spellStart"/>
+      <w:proofErr w:type="gramStart"/>
       <w:r>
         <w:rPr>
           <w:rFonts w:ascii="Consolas" w:eastAsia="Times New Roman" w:hAnsi="Consolas" w:cs="Times New Roman"/>
@@ -2463,6 +2863,7 @@
         </w:rPr>
         <w:t>ssl</w:t>
       </w:r>
+      <w:proofErr w:type="spellEnd"/>
       <w:r>
         <w:rPr>
           <w:rFonts w:ascii="Consolas" w:eastAsia="Times New Roman" w:hAnsi="Consolas" w:cs="Times New Roman"/>
@@ -2472,6 +2873,7 @@
         </w:rPr>
         <w:t>=</w:t>
       </w:r>
+      <w:proofErr w:type="gramEnd"/>
       <w:r>
         <w:rPr>
           <w:rFonts w:ascii="Consolas" w:eastAsia="Times New Roman" w:hAnsi="Consolas" w:cs="Times New Roman"/>
@@ -2511,6 +2913,7 @@
         </w:rPr>
         <w:t xml:space="preserve">    </w:t>
       </w:r>
+      <w:proofErr w:type="spellStart"/>
       <w:r>
         <w:rPr>
           <w:rFonts w:ascii="Consolas" w:eastAsia="Times New Roman" w:hAnsi="Consolas" w:cs="Times New Roman"/>
@@ -2520,6 +2923,7 @@
         </w:rPr>
         <w:t>decode_responses</w:t>
       </w:r>
+      <w:proofErr w:type="spellEnd"/>
       <w:r>
         <w:rPr>
           <w:rFonts w:ascii="Consolas" w:eastAsia="Times New Roman" w:hAnsi="Consolas" w:cs="Times New Roman"/>
@@ -2568,6 +2972,7 @@
         </w:rPr>
         <w:t xml:space="preserve">    </w:t>
       </w:r>
+      <w:proofErr w:type="spellStart"/>
       <w:r>
         <w:rPr>
           <w:rFonts w:ascii="Consolas" w:eastAsia="Times New Roman" w:hAnsi="Consolas" w:cs="Times New Roman"/>
@@ -2577,6 +2982,7 @@
         </w:rPr>
         <w:t>socket_timeout</w:t>
       </w:r>
+      <w:proofErr w:type="spellEnd"/>
       <w:r>
         <w:rPr>
           <w:rFonts w:ascii="Consolas" w:eastAsia="Times New Roman" w:hAnsi="Consolas" w:cs="Times New Roman"/>
@@ -2697,63 +3103,51 @@
     </w:p>
     <w:p/>
     <w:p>
-      <w:pPr>
-        <w:rPr>
-          <w:b/>
-        </w:rPr>
-      </w:pPr>
       <w:r>
         <w:lastRenderedPageBreak/>
+        <w:t xml:space="preserve">Get app.py code from cache.py </w:t>
+      </w:r>
+      <w:r>
+        <w:t xml:space="preserve">- </w:t>
+      </w:r>
+      <w:r>
+        <w:rPr>
+          <w:b/>
+        </w:rPr>
+        <w:t>AWS/26-8-3 Python and node deployment with RDS/python-backend-testing</w:t>
+      </w:r>
+    </w:p>
+    <w:p>
+      <w:r>
+        <w:t>https://github.com/itmukesh-16/DevOps-With-Multicloud-/tree/main/AWS/26-8-3%20Python%20and%20node%20deployment%20with%20RDS/python-backend-testing</w:t>
+      </w:r>
+    </w:p>
+    <w:p>
+      <w:pPr>
+        <w:rPr>
+          <w:b/>
+        </w:rPr>
+      </w:pPr>
+      <w:r>
         <w:t xml:space="preserve">Then run -&gt; </w:t>
       </w:r>
       <w:r>
         <w:rPr>
           <w:b/>
         </w:rPr>
-        <w:t>Python3 app.py</w:t>
-      </w:r>
-    </w:p>
-    <w:p>
-      <w:pPr>
-        <w:rPr>
-          <w:b/>
-        </w:rPr>
-      </w:pPr>
-    </w:p>
-    <w:p>
-      <w:pPr>
-        <w:rPr>
-          <w:b/>
-        </w:rPr>
-      </w:pPr>
-    </w:p>
-    <w:p>
-      <w:pPr>
-        <w:rPr>
-          <w:b/>
-        </w:rPr>
-      </w:pPr>
-    </w:p>
-    <w:p>
-      <w:pPr>
-        <w:rPr>
-          <w:b/>
-        </w:rPr>
-      </w:pPr>
-    </w:p>
-    <w:p>
-      <w:pPr>
-        <w:rPr>
-          <w:b/>
-          <w:noProof/>
-        </w:rPr>
-      </w:pPr>
-    </w:p>
-    <w:p>
-      <w:pPr>
-        <w:rPr>
-          <w:b/>
-          <w:noProof/>
+        <w:t>Python3 app.p</w:t>
+      </w:r>
+      <w:r>
+        <w:rPr>
+          <w:b/>
+        </w:rPr>
+        <w:t>y</w:t>
+      </w:r>
+    </w:p>
+    <w:p>
+      <w:pPr>
+        <w:rPr>
+          <w:b/>
         </w:rPr>
       </w:pPr>
     </w:p>
@@ -2770,13 +3164,27 @@
         <w:rPr>
           <w:b/>
         </w:rPr>
-        <w:t xml:space="preserve"> curl </w:t>
-      </w:r>
-      <w:r>
-        <w:rPr>
-          <w:b/>
-        </w:rPr>
-        <w:t xml:space="preserve"> -X Get and observe the source .</w:t>
+        <w:t xml:space="preserve"> </w:t>
+      </w:r>
+      <w:proofErr w:type="gramStart"/>
+      <w:r>
+        <w:rPr>
+          <w:b/>
+        </w:rPr>
+        <w:t xml:space="preserve">curl </w:t>
+      </w:r>
+      <w:r>
+        <w:rPr>
+          <w:b/>
+        </w:rPr>
+        <w:t xml:space="preserve"> -</w:t>
+      </w:r>
+      <w:proofErr w:type="gramEnd"/>
+      <w:r>
+        <w:rPr>
+          <w:b/>
+        </w:rPr>
+        <w:t>X Get and observe the source .</w:t>
       </w:r>
     </w:p>
     <w:p>
@@ -2784,11 +3192,16 @@
         <w:t>Initially t</w:t>
       </w:r>
       <w:r>
-        <w:t xml:space="preserve">he data fetched from RDS reader </w:t>
+        <w:t xml:space="preserve">he data fetched from RDS </w:t>
+      </w:r>
+      <w:proofErr w:type="gramStart"/>
+      <w:r>
+        <w:t xml:space="preserve">reader </w:t>
       </w:r>
       <w:r>
         <w:t>.</w:t>
       </w:r>
+      <w:proofErr w:type="gramEnd"/>
     </w:p>
     <w:p>
       <w:pPr>
@@ -2850,17 +3263,54 @@
     </w:p>
     <w:p>
       <w:r>
-        <w:t>Then again get all user data and observe the source .</w:t>
-      </w:r>
-    </w:p>
-    <w:p>
-      <w:r>
-        <w:t>When the same data fetched multiple times , the frequently used data stored inside Redis Cache.</w:t>
-      </w:r>
-    </w:p>
-    <w:p>
-      <w:r>
-        <w:t>And in the next time when the same user or different user tried to access same data ,instead of going to read replica it fetched the data from the Redis cache .</w:t>
+        <w:t xml:space="preserve">Then again get all user data and observe the </w:t>
+      </w:r>
+      <w:proofErr w:type="gramStart"/>
+      <w:r>
+        <w:t>source .</w:t>
+      </w:r>
+      <w:proofErr w:type="gramEnd"/>
+    </w:p>
+    <w:p>
+      <w:r>
+        <w:t xml:space="preserve">When the same data fetched multiple </w:t>
+      </w:r>
+      <w:proofErr w:type="gramStart"/>
+      <w:r>
+        <w:t>times ,</w:t>
+      </w:r>
+      <w:proofErr w:type="gramEnd"/>
+      <w:r>
+        <w:t xml:space="preserve"> the frequently used data stored inside </w:t>
+      </w:r>
+      <w:proofErr w:type="spellStart"/>
+      <w:r>
+        <w:t>Redis</w:t>
+      </w:r>
+      <w:proofErr w:type="spellEnd"/>
+      <w:r>
+        <w:t xml:space="preserve"> Cache.</w:t>
+      </w:r>
+    </w:p>
+    <w:p>
+      <w:r>
+        <w:t xml:space="preserve">And in the next time when the same user or different user tried to access same </w:t>
+      </w:r>
+      <w:proofErr w:type="gramStart"/>
+      <w:r>
+        <w:t>data ,instead</w:t>
+      </w:r>
+      <w:proofErr w:type="gramEnd"/>
+      <w:r>
+        <w:t xml:space="preserve"> of going to read replica it fetched the data from the </w:t>
+      </w:r>
+      <w:proofErr w:type="spellStart"/>
+      <w:r>
+        <w:t>Redis</w:t>
+      </w:r>
+      <w:proofErr w:type="spellEnd"/>
+      <w:r>
+        <w:t xml:space="preserve"> cache .</w:t>
       </w:r>
     </w:p>
     <w:p>
@@ -2868,7 +3318,6 @@
         <w:rPr>
           <w:noProof/>
         </w:rPr>
-        <w:lastRenderedPageBreak/>
         <w:drawing>
           <wp:inline distT="0" distB="0" distL="0" distR="0">
             <wp:extent cx="3054350" cy="2096790"/>
@@ -3020,25 +3469,62 @@
       <w:r>
         <w:t xml:space="preserve"> and install </w:t>
       </w:r>
+      <w:proofErr w:type="spellStart"/>
+      <w:proofErr w:type="gramStart"/>
       <w:r>
         <w:rPr>
           <w:b/>
         </w:rPr>
         <w:t>nginx</w:t>
       </w:r>
+      <w:proofErr w:type="spellEnd"/>
       <w:r>
         <w:t xml:space="preserve"> .</w:t>
       </w:r>
-    </w:p>
-    <w:p>
-      <w:r>
-        <w:t xml:space="preserve">in inside </w:t>
-      </w:r>
-      <w:r>
-        <w:rPr>
-          <w:b/>
-        </w:rPr>
-        <w:t>/usr/share/nginx/html/index.html</w:t>
+      <w:proofErr w:type="gramEnd"/>
+    </w:p>
+    <w:p>
+      <w:proofErr w:type="gramStart"/>
+      <w:r>
+        <w:t>in</w:t>
+      </w:r>
+      <w:proofErr w:type="gramEnd"/>
+      <w:r>
+        <w:t xml:space="preserve"> inside </w:t>
+      </w:r>
+      <w:r>
+        <w:rPr>
+          <w:b/>
+        </w:rPr>
+        <w:t>/</w:t>
+      </w:r>
+      <w:proofErr w:type="spellStart"/>
+      <w:r>
+        <w:rPr>
+          <w:b/>
+        </w:rPr>
+        <w:t>usr</w:t>
+      </w:r>
+      <w:proofErr w:type="spellEnd"/>
+      <w:r>
+        <w:rPr>
+          <w:b/>
+        </w:rPr>
+        <w:t>/share/</w:t>
+      </w:r>
+      <w:proofErr w:type="spellStart"/>
+      <w:r>
+        <w:rPr>
+          <w:b/>
+        </w:rPr>
+        <w:t>nginx</w:t>
+      </w:r>
+      <w:proofErr w:type="spellEnd"/>
+      <w:r>
+        <w:rPr>
+          <w:b/>
+        </w:rPr>
+        <w:t>/html/index.html</w:t>
       </w:r>
       <w:r>
         <w:t xml:space="preserve"> folder </w:t>
@@ -3048,13 +3534,26 @@
       </w:r>
     </w:p>
     <w:p>
-      <w:r>
-        <w:t>we can configure without proxy or with reverse-proxy.</w:t>
-      </w:r>
-    </w:p>
-    <w:p>
-      <w:r>
-        <w:t>We can also  configure ROUTE53 for the Domain .</w:t>
+      <w:proofErr w:type="gramStart"/>
+      <w:r>
+        <w:t>we</w:t>
+      </w:r>
+      <w:proofErr w:type="gramEnd"/>
+      <w:r>
+        <w:t xml:space="preserve"> can configure without proxy or with reverse-proxy.</w:t>
+      </w:r>
+    </w:p>
+    <w:p>
+      <w:r>
+        <w:t xml:space="preserve">We can </w:t>
+      </w:r>
+      <w:proofErr w:type="gramStart"/>
+      <w:r>
+        <w:t>also  configure</w:t>
+      </w:r>
+      <w:proofErr w:type="gramEnd"/>
+      <w:r>
+        <w:t xml:space="preserve"> ROUTE53 for the Domain .</w:t>
       </w:r>
     </w:p>
     <w:p/>
@@ -3835,6 +4334,29 @@
       <w:rFonts w:ascii="Tahoma" w:hAnsi="Tahoma" w:cs="Tahoma"/>
       <w:sz w:val="16"/>
       <w:szCs w:val="16"/>
+    </w:rPr>
+  </w:style>
+  <w:style w:type="character" w:styleId="Hyperlink">
+    <w:name w:val="Hyperlink"/>
+    <w:basedOn w:val="DefaultParagraphFont"/>
+    <w:uiPriority w:val="99"/>
+    <w:unhideWhenUsed/>
+    <w:rsid w:val="002873FF"/>
+    <w:rPr>
+      <w:color w:val="0000FF" w:themeColor="hyperlink"/>
+      <w:u w:val="single"/>
+    </w:rPr>
+  </w:style>
+  <w:style w:type="character" w:styleId="FollowedHyperlink">
+    <w:name w:val="FollowedHyperlink"/>
+    <w:basedOn w:val="DefaultParagraphFont"/>
+    <w:uiPriority w:val="99"/>
+    <w:semiHidden/>
+    <w:unhideWhenUsed/>
+    <w:rsid w:val="00401D3C"/>
+    <w:rPr>
+      <w:color w:val="800080" w:themeColor="followedHyperlink"/>
+      <w:u w:val="single"/>
     </w:rPr>
   </w:style>
 </w:styles>
@@ -4128,7 +4650,7 @@
 </file>
 
 <file path=customXml/itemProps1.xml><?xml version="1.0" encoding="utf-8"?>
-<ds:datastoreItem xmlns:ds="http://schemas.openxmlformats.org/officeDocument/2006/customXml" ds:itemID="{ED9D5DDA-2AC3-4295-BD35-AD5F88452AA2}">
+<ds:datastoreItem xmlns:ds="http://schemas.openxmlformats.org/officeDocument/2006/customXml" ds:itemID="{D11CD180-7289-4181-9455-D332AA01F548}">
   <ds:schemaRefs>
     <ds:schemaRef ds:uri="http://schemas.openxmlformats.org/officeDocument/2006/bibliography"/>
   </ds:schemaRefs>

</xml_diff>